<commit_message>
Modified reports and AI prompt
</commit_message>
<xml_diff>
--- a/ARCHIVIO/Marco Rossi_12345678_Junior_carie_genetics.docx
+++ b/ARCHIVIO/Marco Rossi_12345678_Junior_carie_genetics.docx
@@ -420,7 +420,7 @@
                 <w:szCs w:val="24"/>
                 <w:lang w:val="en-US" w:eastAsia="en-US" w:bidi="ar-SA"/>
               </w:rPr>
-              <w:t>04/11/2024 12:34:16</w:t>
+              <w:t>07/11/2024 12:29:39</w:t>
             </w:r>
           </w:p>
         </w:tc>
@@ -19078,7 +19078,7 @@
               <w:szCs w:val="16"/>
               <w:lang w:val="en-US" w:eastAsia="en-US" w:bidi="ar-SA"/>
             </w:rPr>
-            <w:t>Paziente: Marco Rossi - Referto emesso il 04/11/2024 12:34:16 dal Centro Altamedica di Roma</w:t>
+            <w:t>Paziente: Marco Rossi - Referto emesso il 07/11/2024 12:29:39 dal Centro Altamedica di Roma</w:t>
           </w:r>
         </w:p>
       </w:tc>

</xml_diff>